<commit_message>
docs: record verified GitHub upload in project report
</commit_message>
<xml_diff>
--- a/Laporan_Tahap_2_dan_3_PadiCare_REVISI.docx
+++ b/Laporan_Tahap_2_dan_3_PadiCare_REVISI.docx
@@ -7133,7 +7133,7 @@
         <w:spacing w:after="140"/>
       </w:pPr>
       <w:r>
-        <w:t xml:space="preserve">Kode PadiCare berada dalam repositori Git lokal. Pemilik proyek telah memberikan URL repositori GitHub: </w:t>
+        <w:t xml:space="preserve">Kode sumber PadiCare telah diunggah ke repositori GitHub: </w:t>
       </w:r>
       <w:hyperlink r:id="rId27">
         <w:r>
@@ -7145,7 +7145,7 @@
         </w:r>
       </w:hyperlink>
       <w:r>
-        <w:t>. Commit lokal terakhir adalah a807870 tanggal 13 Oktober 2026 pada cabang master. Saat laporan ini diperbarui, remote Git belum terpasang di checkout lokal dan perubahan model lima kelas masih belum di-commit. Karena itu URL tersebut belum menjadi bukti bahwa kode versi lima kelas sudah terunggah.</w:t>
+        <w:t>. Pada 16 Oktober 2026, commit ekspansi model lima kelas d272a2a telah terverifikasi pada cabang main. Dataset citra mentah tetap disimpan di luar Git sesuai konfigurasi .gitignore.</w:t>
       </w:r>
     </w:p>
     <w:p>
@@ -7343,7 +7343,7 @@
         <w:spacing w:after="140"/>
       </w:pPr>
       <w:r>
-        <w:t>Luaran Tahap 2 mencakup diagram alur, use case, navigasi, model data, wireframe, purwarupa, dan rancangan halaman. Luaran Tahap 3 menghasilkan proyek Flutter, fungsi pemilihan foto, pratinjau, inferensi TFLite lima kategori, validasi, dokumentasi, dan APK Android. URL repositori GitHub sudah dicantumkan; sinkronisasi perubahan lima kelas serta pengujian kamera fisik masih menjadi pekerjaan lanjutan.</w:t>
+        <w:t>Luaran Tahap 2 mencakup diagram alur, use case, navigasi, model data, wireframe, purwarupa, dan rancangan halaman. Luaran Tahap 3 menghasilkan proyek Flutter, fungsi pemilihan foto, pratinjau, inferensi TFLite lima kategori, validasi, dokumentasi, dan APK Android. Kode dan perubahan model lima kelas sudah diunggah ke repositori GitHub; pengujian kamera fisik masih menjadi pekerjaan lanjutan.</w:t>
       </w:r>
     </w:p>
     <w:p>
@@ -10440,7 +10440,7 @@
         <w:spacing w:after="140"/>
       </w:pPr>
       <w:r>
-        <w:t>Pengujian kamera pada HP Android fisik tetap menjadi tugas manual pengguna. Repositori GitHub telah dibuat pada URL yang dicantumkan di Bagian II, namun perubahan lima kelas masih perlu di-commit dan diunggah agar isi repositori sesuai dengan APK terbaru.</w:t>
+        <w:t>Pengujian kamera pada HP Android fisik tetap menjadi tugas manual pengguna. Kode sumber dan perubahan model lima kelas telah di-commit serta diunggah ke cabang main pada repositori GitHub yang dicantumkan di Bagian II.</w:t>
       </w:r>
     </w:p>
     <w:sectPr>

</xml_diff>